<commit_message>
P11 — periksa, lalu simpan
</commit_message>
<xml_diff>
--- a/Worksheet_P11/MUHAMMAD PRAMUDYA ALDIANSYAH - - 11. Worksheet_PABW_Pertemuan11 - ID.docx
+++ b/Worksheet_P11/MUHAMMAD PRAMUDYA ALDIANSYAH - - 11. Worksheet_PABW_Pertemuan11 - ID.docx
@@ -3162,7 +3162,7 @@
               <w:spacing w:before="20" w:after="20" w:line="252" w:lineRule="auto"/>
             </w:pPr>
             <w:r>
-              <w:t>Data.js</w:t>
+              <w:t>Js/app.js</w:t>
             </w:r>
           </w:p>
         </w:tc>
@@ -3234,6 +3234,9 @@
             <w:pPr>
               <w:spacing w:before="20" w:after="20" w:line="252" w:lineRule="auto"/>
             </w:pPr>
+            <w:r>
+              <w:t>Js/app.js</w:t>
+            </w:r>
           </w:p>
         </w:tc>
       </w:tr>
@@ -3303,6 +3306,9 @@
             <w:pPr>
               <w:spacing w:before="20" w:after="20" w:line="252" w:lineRule="auto"/>
             </w:pPr>
+            <w:r>
+              <w:t>Js/dom.js</w:t>
+            </w:r>
           </w:p>
         </w:tc>
       </w:tr>
@@ -3372,6 +3378,9 @@
             <w:pPr>
               <w:spacing w:before="20" w:after="20" w:line="252" w:lineRule="auto"/>
             </w:pPr>
+            <w:r>
+              <w:t xml:space="preserve">Js/app.js dan js/dom.js </w:t>
+            </w:r>
           </w:p>
         </w:tc>
       </w:tr>
@@ -3441,6 +3450,9 @@
             <w:pPr>
               <w:spacing w:before="20" w:after="20" w:line="252" w:lineRule="auto"/>
             </w:pPr>
+            <w:r>
+              <w:t>Js/app.js</w:t>
+            </w:r>
           </w:p>
         </w:tc>
       </w:tr>
@@ -5609,6 +5621,9 @@
             <w:pPr>
               <w:spacing w:before="20" w:after="20" w:line="252" w:lineRule="auto"/>
             </w:pPr>
+            <w:r>
+              <w:t>Tidak ada galat impor; filter sudah berfungsi setelah diperbaiki</w:t>
+            </w:r>
           </w:p>
         </w:tc>
       </w:tr>
@@ -5678,6 +5693,9 @@
             <w:pPr>
               <w:spacing w:before="20" w:after="20" w:line="252" w:lineRule="auto"/>
             </w:pPr>
+            <w:r>
+              <w:t>Tombol filter kategori sudah berfungsi kembali.</w:t>
+            </w:r>
           </w:p>
         </w:tc>
       </w:tr>
@@ -5747,6 +5765,9 @@
             <w:pPr>
               <w:spacing w:before="20" w:after="20" w:line="252" w:lineRule="auto"/>
             </w:pPr>
+            <w:r>
+              <w:t>Berisi import modul, pemanggilan renderProfil(profil), render(state), pasangEvents(), serta log pemanggilan fungsi dari data.js.</w:t>
+            </w:r>
           </w:p>
         </w:tc>
       </w:tr>
@@ -5816,6 +5837,9 @@
             <w:pPr>
               <w:spacing w:before="20" w:after="20" w:line="252" w:lineRule="auto"/>
             </w:pPr>
+            <w:r>
+              <w:t>Lima modul: data.js, state.js, dom.js, events.js, dan app.js. api.js</w:t>
+            </w:r>
           </w:p>
         </w:tc>
       </w:tr>
@@ -5885,6 +5909,9 @@
             <w:pPr>
               <w:spacing w:before="20" w:after="20" w:line="252" w:lineRule="auto"/>
             </w:pPr>
+            <w:r>
+              <w:t>Ya, semuanya berawalan ./ dan berakhiran .js</w:t>
+            </w:r>
           </w:p>
         </w:tc>
       </w:tr>
@@ -6011,7 +6038,6 @@
                 <w:color w:val="E2E8F0"/>
                 <w:sz w:val="17"/>
               </w:rPr>
-              <w:lastRenderedPageBreak/>
               <w:t>git add .</w:t>
             </w:r>
             <w:r>
@@ -7253,7 +7279,16 @@
           <w:p>
             <w:pPr>
               <w:spacing w:before="20" w:after="20" w:line="252" w:lineRule="auto"/>
-            </w:pPr>
+              <w:rPr>
+                <w:lang w:val="id-ID"/>
+              </w:rPr>
+            </w:pPr>
+            <w:r>
+              <w:rPr>
+                <w:lang w:val="id-ID"/>
+              </w:rPr>
+              <w:t>Ketika kategori dipilih, nilai state.kategoriAktif berubah sesuai kategori yang dipilih dan daftar proyek diperbarui.</w:t>
+            </w:r>
           </w:p>
         </w:tc>
       </w:tr>
@@ -7322,7 +7357,16 @@
           <w:p>
             <w:pPr>
               <w:spacing w:before="20" w:after="20" w:line="252" w:lineRule="auto"/>
-            </w:pPr>
+              <w:rPr>
+                <w:lang w:val="id-ID"/>
+              </w:rPr>
+            </w:pPr>
+            <w:r>
+              <w:rPr>
+                <w:lang w:val="id-ID"/>
+              </w:rPr>
+              <w:t>Objek state menampilkan data daftarProyek dan kategoriAktif di Console</w:t>
+            </w:r>
           </w:p>
         </w:tc>
       </w:tr>
@@ -7391,7 +7435,16 @@
           <w:p>
             <w:pPr>
               <w:spacing w:before="20" w:after="20" w:line="252" w:lineRule="auto"/>
-            </w:pPr>
+              <w:rPr>
+                <w:lang w:val="id-ID"/>
+              </w:rPr>
+            </w:pPr>
+            <w:r>
+              <w:rPr>
+                <w:lang w:val="id-ID"/>
+              </w:rPr>
+              <w:t>Perubahan kategori dilakukan melalui fungsi pilihKategori() di state.js, bukan dengan mengubah state secara langsung di events.js.</w:t>
+            </w:r>
           </w:p>
         </w:tc>
       </w:tr>
@@ -7461,6 +7514,9 @@
             <w:pPr>
               <w:spacing w:before="20" w:after="20" w:line="252" w:lineRule="auto"/>
             </w:pPr>
+            <w:r>
+              <w:t>Daftar proyek tidak bertambah atau berlipat karena daftar lama dikosongkan sebelum daftar baru ditampilkan.</w:t>
+            </w:r>
           </w:p>
         </w:tc>
       </w:tr>
@@ -8700,6 +8756,9 @@
             <w:pPr>
               <w:spacing w:before="20" w:after="20" w:line="252" w:lineRule="auto"/>
             </w:pPr>
+            <w:r>
+              <w:t>semua</w:t>
+            </w:r>
           </w:p>
         </w:tc>
         <w:tc>
@@ -8716,6 +8775,9 @@
             <w:pPr>
               <w:spacing w:before="20" w:after="20" w:line="252" w:lineRule="auto"/>
             </w:pPr>
+            <w:r>
+              <w:t>Semua proyek ditampilkan Ketika belum ada pilihan tersimpan</w:t>
+            </w:r>
           </w:p>
         </w:tc>
       </w:tr>
@@ -8762,6 +8824,9 @@
             <w:pPr>
               <w:spacing w:before="20" w:after="20" w:line="252" w:lineRule="auto"/>
             </w:pPr>
+            <w:r>
+              <w:t>Urutan asli dari daftar proyek</w:t>
+            </w:r>
           </w:p>
         </w:tc>
         <w:tc>
@@ -8778,6 +8843,9 @@
             <w:pPr>
               <w:spacing w:before="20" w:after="20" w:line="252" w:lineRule="auto"/>
             </w:pPr>
+            <w:r>
+              <w:t>Daftar mengikuti urutan data awal jika pengguna belum memilih pengaturan lain.</w:t>
+            </w:r>
           </w:p>
         </w:tc>
       </w:tr>
@@ -8798,6 +8866,7 @@
           <w:b/>
           <w:color w:val="003796"/>
         </w:rPr>
+        <w:lastRenderedPageBreak/>
         <w:t>D.3  Batas penyimpanan klien</w:t>
       </w:r>
     </w:p>
@@ -8850,7 +8919,6 @@
                 <w:color w:val="FFFFFF"/>
                 <w:sz w:val="18"/>
               </w:rPr>
-              <w:lastRenderedPageBreak/>
               <w:t>Batas</w:t>
             </w:r>
           </w:p>
@@ -9448,6 +9516,9 @@
             <w:pPr>
               <w:spacing w:before="20" w:after="20" w:line="252" w:lineRule="auto"/>
             </w:pPr>
+            <w:r>
+              <w:t xml:space="preserve">Ya </w:t>
+            </w:r>
           </w:p>
         </w:tc>
         <w:tc>
@@ -9464,6 +9535,9 @@
             <w:pPr>
               <w:spacing w:before="20" w:after="20" w:line="252" w:lineRule="auto"/>
             </w:pPr>
+            <w:r>
+              <w:t>Agar pilihan kategori tidak tereset saat halaman di refresh</w:t>
+            </w:r>
           </w:p>
         </w:tc>
       </w:tr>
@@ -9510,6 +9584,9 @@
             <w:pPr>
               <w:spacing w:before="20" w:after="20" w:line="252" w:lineRule="auto"/>
             </w:pPr>
+            <w:r>
+              <w:t>tidak</w:t>
+            </w:r>
           </w:p>
         </w:tc>
         <w:tc>
@@ -9526,6 +9603,9 @@
             <w:pPr>
               <w:spacing w:before="20" w:after="20" w:line="252" w:lineRule="auto"/>
             </w:pPr>
+            <w:r>
+              <w:t>Fitur kata kunci belum saya masukan pada proyek saat ini</w:t>
+            </w:r>
           </w:p>
         </w:tc>
       </w:tr>
@@ -9775,7 +9855,15 @@
                 <w:color w:val="E2E8F0"/>
                 <w:sz w:val="17"/>
               </w:rPr>
-              <w:t># P11 — halaman mengingat</w:t>
+              <w:t xml:space="preserve"># </w:t>
+            </w:r>
+            <w:r>
+              <w:rPr>
+                <w:rFonts w:ascii="DejaVu Sans Mono" w:eastAsia="DejaVu Sans Mono" w:hAnsi="DejaVu Sans Mono" w:cs="DejaVu Sans Mono"/>
+                <w:color w:val="E2E8F0"/>
+                <w:sz w:val="17"/>
+              </w:rPr>
+              <w:t xml:space="preserve"> </w:t>
             </w:r>
           </w:p>
         </w:tc>
@@ -10737,6 +10825,9 @@
             <w:pPr>
               <w:spacing w:before="20" w:after="20" w:line="252" w:lineRule="auto"/>
             </w:pPr>
+            <w:r>
+              <w:t>Setelah halaman dimuat ulang, halaman tetap terbuka dan menggunakan nilai bawaan</w:t>
+            </w:r>
           </w:p>
         </w:tc>
       </w:tr>
@@ -10765,6 +10856,7 @@
                 <w:rFonts w:cs="Carlito"/>
                 <w:sz w:val="18"/>
               </w:rPr>
+              <w:lastRenderedPageBreak/>
               <w:t>localStorage.setItem("pabw-p11", "{}")</w:t>
             </w:r>
           </w:p>
@@ -10806,6 +10898,9 @@
             <w:pPr>
               <w:spacing w:before="20" w:after="20" w:line="252" w:lineRule="auto"/>
             </w:pPr>
+            <w:r>
+              <w:t>Setelah halaman dimuat ulang, simpanan dengan versi yang tidak cocok dihapus dan nilai bawaan digunakan.</w:t>
+            </w:r>
           </w:p>
         </w:tc>
       </w:tr>
@@ -10875,6 +10970,9 @@
             <w:pPr>
               <w:spacing w:before="20" w:after="20" w:line="252" w:lineRule="auto"/>
             </w:pPr>
+            <w:r>
+              <w:t>Fungsi muat() menghasilkan null tanpa galat yang tidak tertangani.</w:t>
+            </w:r>
           </w:p>
         </w:tc>
       </w:tr>
@@ -10895,7 +10993,6 @@
           <w:b/>
           <w:color w:val="003796"/>
         </w:rPr>
-        <w:lastRenderedPageBreak/>
         <w:t>E.4  Catatan: apa yang sengaja tidak saya simpan</w:t>
       </w:r>
     </w:p>
@@ -10989,6 +11086,9 @@
             <w:pPr>
               <w:spacing w:before="20" w:after="20" w:line="252" w:lineRule="auto"/>
             </w:pPr>
+            <w:r>
+              <w:t xml:space="preserve">Token </w:t>
+            </w:r>
           </w:p>
         </w:tc>
         <w:tc>
@@ -11010,7 +11110,7 @@
                 <w:rFonts w:cs="Carlito"/>
                 <w:sz w:val="19"/>
               </w:rPr>
-              <w:t>Token dan kata sandi tidak terenkripsi di peramban</w:t>
+              <w:t>Token tidak terenkripsi di peramban sehingga berisiko dibaca oleh pihak yang memiliki akses ke penyimpanan peramban.</w:t>
             </w:r>
           </w:p>
         </w:tc>
@@ -11035,6 +11135,9 @@
             <w:pPr>
               <w:spacing w:before="20" w:after="20" w:line="252" w:lineRule="auto"/>
             </w:pPr>
+            <w:r>
+              <w:t>Kata sandi</w:t>
+            </w:r>
           </w:p>
         </w:tc>
         <w:tc>
@@ -11051,6 +11154,9 @@
             <w:pPr>
               <w:spacing w:before="20" w:after="20" w:line="252" w:lineRule="auto"/>
             </w:pPr>
+            <w:r>
+              <w:t>Kata sandi tidak terenkripsi di peramban sehingga berisiko disalahgunakan jika tersimpan dan diakses pihak lain.</w:t>
+            </w:r>
           </w:p>
         </w:tc>
       </w:tr>
@@ -11506,7 +11612,11 @@
               <w:right w:val="single" w:sz="4" w:space="0" w:color="B9C6E2"/>
             </w:tcBorders>
           </w:tcPr>
-          <w:p/>
+          <w:p>
+            <w:r>
+              <w:t>state.js bertanggung jawab mengelola state, mengubah kategori aktif, serta menyimpan dan memuat pilihan menggunakan localStorage. Berkas app.js mengimpor fungsi inisialisasiState dari state.js, sedangkan events.js mengimpor state, pilihKategori, dan aturUlang dari state.js.</w:t>
+            </w:r>
+          </w:p>
         </w:tc>
       </w:tr>
       <w:tr>
@@ -11568,7 +11678,11 @@
               <w:right w:val="single" w:sz="4" w:space="0" w:color="B9C6E2"/>
             </w:tcBorders>
           </w:tcPr>
-          <w:p/>
+          <w:p>
+            <w:r>
+              <w:t>./ menunjukkan bahwa berkas diimpor dari direktori yang sama atau relatif terhadap berkas saat ini, sedangkan .js menunjukkan nama berkas JavaScript secara lengkap. Jika jalurnya salah, Console dapat menampilkan galat impor seperti Failed to resolve module specifier atau Failed to load module script.</w:t>
+            </w:r>
+          </w:p>
         </w:tc>
       </w:tr>
       <w:tr>
@@ -11630,7 +11744,11 @@
               <w:right w:val="single" w:sz="4" w:space="0" w:color="B9C6E2"/>
             </w:tcBorders>
           </w:tcPr>
-          <w:p/>
+          <w:p>
+            <w:r>
+              <w:t>Sebelumnya, kategori aktif dapat ditentukan melalui DOM, seperti tombol yang memiliki kelas aktif. Cara tersebut dapat membuat keadaan tidak konsisten ketika daftar digambar ulang karena tampilan DOM bukan sumber utama state aplikasi.</w:t>
+            </w:r>
+          </w:p>
         </w:tc>
       </w:tr>
       <w:tr>
@@ -11692,7 +11810,11 @@
               <w:right w:val="single" w:sz="4" w:space="0" w:color="B9C6E2"/>
             </w:tcBorders>
           </w:tcPr>
-          <w:p/>
+          <w:p>
+            <w:r>
+              <w:t>Aplikasi harus menggunakan nilai bawaan, yaitu kategori semua, karena belum ada data yang tersimpan di localStorage.</w:t>
+            </w:r>
+          </w:p>
         </w:tc>
       </w:tr>
       <w:tr>
@@ -11754,7 +11876,11 @@
               <w:right w:val="single" w:sz="4" w:space="0" w:color="B9C6E2"/>
             </w:tcBorders>
           </w:tcPr>
-          <w:p/>
+          <w:p>
+            <w:r>
+              <w:t>Agar kesalahan data tersimpan tidak menghentikan aplikasi. Saya menggunakan try...catch pada fungsi muat() untuk menangani JSON yang rusak, menghapus simpanan yang tidak valid, lalu menggunakan nilai bawaan.</w:t>
+            </w:r>
+          </w:p>
         </w:tc>
       </w:tr>
       <w:tr>
@@ -11816,7 +11942,11 @@
               <w:right w:val="single" w:sz="4" w:space="0" w:color="B9C6E2"/>
             </w:tcBorders>
           </w:tcPr>
-          <w:p/>
+          <w:p>
+            <w:r>
+              <w:t>Kategori filter yang sedang dipilih dapat disimpan di localStorage agar tetap diingat saat halaman dibuka kembali. Token autentikasi atau kata sandi tidak boleh disimpan begitu saja karena localStorage tidak mengenkripsi data secara otomatis.</w:t>
+            </w:r>
+          </w:p>
         </w:tc>
       </w:tr>
       <w:tr>
@@ -11853,6 +11983,7 @@
           <w:b/>
           <w:color w:val="003796"/>
         </w:rPr>
+        <w:lastRenderedPageBreak/>
         <w:t>F.1  Periksa satu per satu</w:t>
       </w:r>
     </w:p>
@@ -11895,7 +12026,15 @@
                 <w:color w:val="003796"/>
                 <w:sz w:val="22"/>
               </w:rPr>
-              <w:t>☐  Berkas  lima modul ada di repositori: data.js, state.js, dom.js, events.js, app.js — ditambah berkas dari P10 bila ada</w:t>
+              <w:t xml:space="preserve">V </w:t>
+            </w:r>
+            <w:r>
+              <w:rPr>
+                <w:rFonts w:cs="Carlito"/>
+                <w:color w:val="003796"/>
+                <w:sz w:val="22"/>
+              </w:rPr>
+              <w:t xml:space="preserve">  Berkas  lima modul ada di repositori: data.js, state.js, dom.js, events.js, app.js — ditambah berkas dari P10 bila ada</w:t>
             </w:r>
           </w:p>
         </w:tc>
@@ -11921,7 +12060,15 @@
                 <w:color w:val="003796"/>
                 <w:sz w:val="22"/>
               </w:rPr>
-              <w:t>☐  Impor  seluruh jalur berawalan ./ dan berakhiran .js; Console bersih tanpa satu pun galat impor</w:t>
+              <w:t xml:space="preserve">V </w:t>
+            </w:r>
+            <w:r>
+              <w:rPr>
+                <w:rFonts w:cs="Carlito"/>
+                <w:color w:val="003796"/>
+                <w:sz w:val="22"/>
+              </w:rPr>
+              <w:t xml:space="preserve">  Impor  seluruh jalur berawalan ./ dan berakhiran .js; Console bersih tanpa satu pun galat impor</w:t>
             </w:r>
           </w:p>
         </w:tc>
@@ -11947,7 +12094,15 @@
                 <w:color w:val="003796"/>
                 <w:sz w:val="22"/>
               </w:rPr>
-              <w:t>☐  Perilaku  halaman bekerja persis seperti akhir Pertemuan 9; tidak ada fitur baru yang ditambahkan</w:t>
+              <w:t xml:space="preserve">V </w:t>
+            </w:r>
+            <w:r>
+              <w:rPr>
+                <w:rFonts w:cs="Carlito"/>
+                <w:color w:val="003796"/>
+                <w:sz w:val="22"/>
+              </w:rPr>
+              <w:t xml:space="preserve">  Perilaku  halaman bekerja persis seperti akhir Pertemuan 9; tidak ada fitur baru yang ditambahkan</w:t>
             </w:r>
           </w:p>
         </w:tc>
@@ -11973,7 +12128,7 @@
                 <w:color w:val="003796"/>
                 <w:sz w:val="22"/>
               </w:rPr>
-              <w:t xml:space="preserve">☐  State  seluruh keadaan yang bisa berubah berada di satu objek state, dan tidak ada keadaan yang </w:t>
+              <w:t xml:space="preserve">V </w:t>
             </w:r>
             <w:r>
               <w:rPr>
@@ -11981,8 +12136,7 @@
                 <w:color w:val="003796"/>
                 <w:sz w:val="22"/>
               </w:rPr>
-              <w:lastRenderedPageBreak/>
-              <w:t>dibaca kembali dari DOM</w:t>
+              <w:t xml:space="preserve">  State  seluruh keadaan yang bisa berubah berada di satu objek state, dan tidak ada keadaan yang dibaca kembali dari DOM</w:t>
             </w:r>
           </w:p>
         </w:tc>
@@ -12008,8 +12162,15 @@
                 <w:color w:val="003796"/>
                 <w:sz w:val="22"/>
               </w:rPr>
-              <w:lastRenderedPageBreak/>
-              <w:t>☐  Pengubah  setiap perubahan keadaan ditulis sebagai fungsi bernama di state.js, dan fungsi itulah yang memanggil render</w:t>
+              <w:t xml:space="preserve">V </w:t>
+            </w:r>
+            <w:r>
+              <w:rPr>
+                <w:rFonts w:cs="Carlito"/>
+                <w:color w:val="003796"/>
+                <w:sz w:val="22"/>
+              </w:rPr>
+              <w:t xml:space="preserve">  Pengubah  setiap perubahan keadaan ditulis sebagai fungsi bernama di state.js, dan fungsi itulah yang memanggil render</w:t>
             </w:r>
           </w:p>
         </w:tc>
@@ -12035,7 +12196,15 @@
                 <w:color w:val="003796"/>
                 <w:sz w:val="22"/>
               </w:rPr>
-              <w:t>☐  Simpanan  pilihan bertahan setelah tab ditutup; JSON dipakai; nilai bawaan terpasang; tombol atur ulang bekerja</w:t>
+              <w:t xml:space="preserve">V </w:t>
+            </w:r>
+            <w:r>
+              <w:rPr>
+                <w:rFonts w:cs="Carlito"/>
+                <w:color w:val="003796"/>
+                <w:sz w:val="22"/>
+              </w:rPr>
+              <w:t xml:space="preserve">  Simpanan  pilihan bertahan setelah tab ditutup; JSON dipakai; nilai bawaan terpasang; tombol atur ulang bekerja</w:t>
             </w:r>
           </w:p>
         </w:tc>
@@ -12061,7 +12230,15 @@
                 <w:color w:val="003796"/>
                 <w:sz w:val="22"/>
               </w:rPr>
-              <w:t>☐  Simpanan rusak  try/catch dipakai, nomor versi diperiksa, dan saya sudah mencoba merusaknya sendiri dari Console</w:t>
+              <w:t xml:space="preserve">V </w:t>
+            </w:r>
+            <w:r>
+              <w:rPr>
+                <w:rFonts w:cs="Carlito"/>
+                <w:color w:val="003796"/>
+                <w:sz w:val="22"/>
+              </w:rPr>
+              <w:t xml:space="preserve">  Simpanan rusak  try/catch dipakai, nomor versi diperiksa, dan saya sudah mencoba merusaknya sendiri dari Console</w:t>
             </w:r>
           </w:p>
         </w:tc>
@@ -12087,7 +12264,15 @@
                 <w:color w:val="003796"/>
                 <w:sz w:val="22"/>
               </w:rPr>
-              <w:t>☐  Deklarasi AI  bagian README menyebutkan bagian mana yang dibantu AI dan bagian mana yang saya kerjakan sendiri</w:t>
+              <w:t xml:space="preserve">V </w:t>
+            </w:r>
+            <w:r>
+              <w:rPr>
+                <w:rFonts w:cs="Carlito"/>
+                <w:color w:val="003796"/>
+                <w:sz w:val="22"/>
+              </w:rPr>
+              <w:t xml:space="preserve">  Deklarasi AI  bagian README menyebutkan bagian mana yang dibantu AI dan bagian mana yang saya kerjakan sendiri</w:t>
             </w:r>
           </w:p>
         </w:tc>
@@ -12113,7 +12298,15 @@
                 <w:color w:val="003796"/>
                 <w:sz w:val="22"/>
               </w:rPr>
-              <w:t>☐  Git  ada lebih dari satu commit hari ini, dan pesan commit-nya menjelaskan isinya</w:t>
+              <w:t xml:space="preserve">V </w:t>
+            </w:r>
+            <w:r>
+              <w:rPr>
+                <w:rFonts w:cs="Carlito"/>
+                <w:color w:val="003796"/>
+                <w:sz w:val="22"/>
+              </w:rPr>
+              <w:t xml:space="preserve">  Git  ada lebih dari satu commit hari ini, dan pesan commit-nya menjelaskan isinya</w:t>
             </w:r>
           </w:p>
         </w:tc>
@@ -12317,6 +12510,9 @@
             <w:pPr>
               <w:spacing w:before="20" w:after="20" w:line="252" w:lineRule="auto"/>
             </w:pPr>
+            <w:r>
+              <w:t>v24.22.0</w:t>
+            </w:r>
           </w:p>
         </w:tc>
         <w:tc>
@@ -12384,6 +12580,9 @@
             <w:pPr>
               <w:spacing w:before="20" w:after="20" w:line="252" w:lineRule="auto"/>
             </w:pPr>
+            <w:r>
+              <w:t>11.19.1</w:t>
+            </w:r>
           </w:p>
         </w:tc>
         <w:tc>
@@ -12534,7 +12733,15 @@
                 <w:color w:val="003796"/>
                 <w:sz w:val="22"/>
               </w:rPr>
-              <w:t>☐  Pengungkapan AI  README menyebutkan bagian mana yang dibantu AI dan bagian mana yang saya kerjakan sendiri</w:t>
+              <w:t xml:space="preserve">V </w:t>
+            </w:r>
+            <w:r>
+              <w:rPr>
+                <w:rFonts w:cs="Carlito"/>
+                <w:color w:val="003796"/>
+                <w:sz w:val="22"/>
+              </w:rPr>
+              <w:t xml:space="preserve">  Pengungkapan AI  README menyebutkan bagian mana yang dibantu AI dan bagian mana yang saya kerjakan sendiri</w:t>
             </w:r>
           </w:p>
         </w:tc>
@@ -12560,7 +12767,15 @@
                 <w:color w:val="003796"/>
                 <w:sz w:val="22"/>
               </w:rPr>
-              <w:t>☐  Keaslian  topik dan isi halaman ini milik saya sendiri, tidak menyalin pekerjaan mahasiswa lain</w:t>
+              <w:t>V</w:t>
+            </w:r>
+            <w:r>
+              <w:rPr>
+                <w:rFonts w:cs="Carlito"/>
+                <w:color w:val="003796"/>
+                <w:sz w:val="22"/>
+              </w:rPr>
+              <w:t xml:space="preserve">  Keaslian  topik dan isi halaman ini milik saya sendiri, tidak menyalin pekerjaan mahasiswa lain</w:t>
             </w:r>
           </w:p>
         </w:tc>
@@ -12761,6 +12976,9 @@
             <w:pPr>
               <w:spacing w:before="20" w:after="20" w:line="252" w:lineRule="auto"/>
             </w:pPr>
+            <w:r>
+              <w:t>25</w:t>
+            </w:r>
           </w:p>
         </w:tc>
         <w:tc>
@@ -12777,6 +12995,12 @@
             <w:pPr>
               <w:spacing w:before="20" w:after="20" w:line="252" w:lineRule="auto"/>
             </w:pPr>
+            <w:r>
+              <w:t xml:space="preserve">Modul dan impor sudah di pecah </w:t>
+            </w:r>
+            <w:r>
+              <w:t>data.js, state.js, dom.js, events.js, app.js</w:t>
+            </w:r>
           </w:p>
         </w:tc>
       </w:tr>
@@ -12846,6 +13070,9 @@
             <w:pPr>
               <w:spacing w:before="20" w:after="20" w:line="252" w:lineRule="auto"/>
             </w:pPr>
+            <w:r>
+              <w:t>25</w:t>
+            </w:r>
           </w:p>
         </w:tc>
         <w:tc>
@@ -12862,6 +13089,12 @@
             <w:pPr>
               <w:spacing w:before="20" w:after="20" w:line="252" w:lineRule="auto"/>
             </w:pPr>
+            <w:r>
+              <w:t>State sudah di pisah dari tampilan dengan o</w:t>
+            </w:r>
+            <w:r>
+              <w:t>bjek state di state.js, fungsi render() di dom.js</w:t>
+            </w:r>
           </w:p>
         </w:tc>
       </w:tr>
@@ -12890,6 +13123,7 @@
                 <w:rFonts w:cs="Carlito"/>
                 <w:sz w:val="18"/>
               </w:rPr>
+              <w:lastRenderedPageBreak/>
               <w:t>Simpan dan muat localStorage</w:t>
             </w:r>
           </w:p>
@@ -12931,6 +13165,9 @@
             <w:pPr>
               <w:spacing w:before="20" w:after="20" w:line="252" w:lineRule="auto"/>
             </w:pPr>
+            <w:r>
+              <w:t>25</w:t>
+            </w:r>
           </w:p>
         </w:tc>
         <w:tc>
@@ -12947,6 +13184,9 @@
             <w:pPr>
               <w:spacing w:before="20" w:after="20" w:line="252" w:lineRule="auto"/>
             </w:pPr>
+            <w:r>
+              <w:t>Fungsi simpan(), muat(), inisialisasiState(), aturUlang() di state.js</w:t>
+            </w:r>
           </w:p>
         </w:tc>
       </w:tr>
@@ -13016,6 +13256,12 @@
             <w:pPr>
               <w:spacing w:before="20" w:after="20" w:line="252" w:lineRule="auto"/>
             </w:pPr>
+            <w:r>
+              <w:t>1</w:t>
+            </w:r>
+            <w:r>
+              <w:t>2</w:t>
+            </w:r>
           </w:p>
         </w:tc>
         <w:tc>
@@ -13032,6 +13278,9 @@
             <w:pPr>
               <w:spacing w:before="20" w:after="20" w:line="252" w:lineRule="auto"/>
             </w:pPr>
+            <w:r>
+              <w:t>Kode muat() sudah diperbaiki untuk menangani JSON tidak valid dan versi yang berbeda. Namun, ketiga skenario pengujian E.3 serta bukti pemulihan halaman perlu diperiksa.</w:t>
+            </w:r>
           </w:p>
         </w:tc>
       </w:tr>
@@ -13101,6 +13350,9 @@
             <w:pPr>
               <w:spacing w:before="20" w:after="20" w:line="252" w:lineRule="auto"/>
             </w:pPr>
+            <w:r>
+              <w:t>9</w:t>
+            </w:r>
           </w:p>
         </w:tc>
         <w:tc>
@@ -13186,6 +13438,9 @@
             <w:pPr>
               <w:spacing w:before="20" w:after="20" w:line="252" w:lineRule="auto"/>
             </w:pPr>
+            <w:r>
+              <w:t>96</w:t>
+            </w:r>
           </w:p>
         </w:tc>
         <w:tc>
@@ -13373,7 +13628,11 @@
               <w:right w:val="single" w:sz="4" w:space="0" w:color="B9C6E2"/>
             </w:tcBorders>
           </w:tcPr>
-          <w:p/>
+          <w:p>
+            <w:r>
+              <w:t>Contoh.json, api.js, README.md</w:t>
+            </w:r>
+          </w:p>
         </w:tc>
       </w:tr>
       <w:tr>
@@ -13405,7 +13664,35 @@
           <w:rFonts w:cs="Carlito"/>
           <w:sz w:val="20"/>
         </w:rPr>
-        <w:t>Tanda tangan: ______________________________     Tanggal: ______________     Jam selesai: __________</w:t>
+        <w:t>Tanda tangan: ______________________________     Tanggal: _</w:t>
+      </w:r>
+      <w:r>
+        <w:rPr>
+          <w:rFonts w:cs="Carlito"/>
+          <w:sz w:val="20"/>
+        </w:rPr>
+        <w:t>14/10/2026</w:t>
+      </w:r>
+      <w:r>
+        <w:rPr>
+          <w:rFonts w:cs="Carlito"/>
+          <w:sz w:val="20"/>
+        </w:rPr>
+        <w:t>_____________     Jam selesai: _</w:t>
+      </w:r>
+      <w:r>
+        <w:rPr>
+          <w:rFonts w:cs="Carlito"/>
+          <w:sz w:val="20"/>
+        </w:rPr>
+        <w:t>23.00</w:t>
+      </w:r>
+      <w:r>
+        <w:rPr>
+          <w:rFonts w:cs="Carlito"/>
+          <w:sz w:val="20"/>
+        </w:rPr>
+        <w:t>_________</w:t>
       </w:r>
     </w:p>
     <w:p>
@@ -14775,6 +15062,9 @@
             <w:pPr>
               <w:spacing w:before="20" w:after="20" w:line="252" w:lineRule="auto"/>
             </w:pPr>
+            <w:r>
+              <w:t>Saat sebuah fungsi atau data perlu digunakan oleh berkas JavaScript lain.</w:t>
+            </w:r>
           </w:p>
         </w:tc>
       </w:tr>
@@ -14844,6 +15134,12 @@
             <w:pPr>
               <w:spacing w:before="20" w:after="20" w:line="252" w:lineRule="auto"/>
             </w:pPr>
+            <w:r>
+              <w:t>ketika</w:t>
+            </w:r>
+            <w:r>
+              <w:t xml:space="preserve"> mengimpor modul yang berada pada jalur relatif dari berkas saat ini.</w:t>
+            </w:r>
           </w:p>
         </w:tc>
       </w:tr>
@@ -14913,6 +15209,12 @@
             <w:pPr>
               <w:spacing w:before="20" w:after="20" w:line="252" w:lineRule="auto"/>
             </w:pPr>
+            <w:r>
+              <w:t>disaat</w:t>
+            </w:r>
+            <w:r>
+              <w:t xml:space="preserve"> aplikasi membutuhkan satu tempat untuk menyimpan keadaan yang dapat berubah, seperti kategori aktif.</w:t>
+            </w:r>
           </w:p>
         </w:tc>
       </w:tr>
@@ -14982,6 +15284,9 @@
             <w:pPr>
               <w:spacing w:before="20" w:after="20" w:line="252" w:lineRule="auto"/>
             </w:pPr>
+            <w:r>
+              <w:t>Saat pengguna mengubah kategori atau menekan tombol Atur Ulang.</w:t>
+            </w:r>
           </w:p>
         </w:tc>
       </w:tr>
@@ -15051,6 +15356,9 @@
             <w:pPr>
               <w:spacing w:before="20" w:after="20" w:line="252" w:lineRule="auto"/>
             </w:pPr>
+            <w:r>
+              <w:t>Setelah keadaan berubah, agar tampilan sesuai dengan isi state.</w:t>
+            </w:r>
           </w:p>
         </w:tc>
       </w:tr>
@@ -15079,6 +15387,7 @@
                 <w:rFonts w:cs="Carlito"/>
                 <w:sz w:val="19"/>
               </w:rPr>
+              <w:lastRenderedPageBreak/>
               <w:t>JSON.stringify</w:t>
             </w:r>
           </w:p>
@@ -15120,6 +15429,12 @@
             <w:pPr>
               <w:spacing w:before="20" w:after="20" w:line="252" w:lineRule="auto"/>
             </w:pPr>
+            <w:r>
+              <w:t>Ketika s</w:t>
+            </w:r>
+            <w:r>
+              <w:t>aat menyimpan objek ke localStorage, karena data penyimpanan ditulis dalam bentuk teks.</w:t>
+            </w:r>
           </w:p>
         </w:tc>
       </w:tr>
@@ -15189,6 +15504,12 @@
             <w:pPr>
               <w:spacing w:before="20" w:after="20" w:line="252" w:lineRule="auto"/>
             </w:pPr>
+            <w:r>
+              <w:t>ketika</w:t>
+            </w:r>
+            <w:r>
+              <w:t xml:space="preserve"> membaca data dari localStorage agar teks JSON bisa digunakan kembali sebagai objek JavaScript.</w:t>
+            </w:r>
           </w:p>
         </w:tc>
       </w:tr>
@@ -15217,7 +15538,6 @@
                 <w:rFonts w:cs="Carlito"/>
                 <w:sz w:val="19"/>
               </w:rPr>
-              <w:lastRenderedPageBreak/>
               <w:t>localStorage.setItem / getItem</w:t>
             </w:r>
           </w:p>
@@ -15259,6 +15579,12 @@
             <w:pPr>
               <w:spacing w:before="20" w:after="20" w:line="252" w:lineRule="auto"/>
             </w:pPr>
+            <w:r>
+              <w:t>dis</w:t>
+            </w:r>
+            <w:r>
+              <w:t>aat menyimpan pilihan kategori pengguna dan mengambilnya kembali ketika halaman dibuka.</w:t>
+            </w:r>
           </w:p>
         </w:tc>
       </w:tr>
@@ -15328,6 +15654,9 @@
             <w:pPr>
               <w:spacing w:before="20" w:after="20" w:line="252" w:lineRule="auto"/>
             </w:pPr>
+            <w:r>
+              <w:t>Saat tombol Atur Ulang ditekan atau data simpanan yang rusak perlu dibuang.</w:t>
+            </w:r>
           </w:p>
         </w:tc>
       </w:tr>
@@ -15397,6 +15726,12 @@
             <w:pPr>
               <w:spacing w:before="20" w:after="20" w:line="252" w:lineRule="auto"/>
             </w:pPr>
+            <w:r>
+              <w:t>ketika</w:t>
+            </w:r>
+            <w:r>
+              <w:t xml:space="preserve"> belum ada data yang tersimpan, sehingga aplikasi tetap menggunakan nilai awal.</w:t>
+            </w:r>
           </w:p>
         </w:tc>
       </w:tr>
@@ -16459,6 +16794,7 @@
           <w:b/>
           <w:color w:val="003796"/>
         </w:rPr>
+        <w:lastRenderedPageBreak/>
         <w:t>Tiga perintah yang akan Anda pakai terus</w:t>
       </w:r>
     </w:p>
@@ -16825,7 +17161,6 @@
                 <w:color w:val="003796"/>
                 <w:sz w:val="20"/>
               </w:rPr>
-              <w:lastRenderedPageBreak/>
               <w:t>Titik pada git add .  Titik itu berarti "seluruh berkas di folder ini".  Tanpa titik, Git tidak tahu apa yang harus disimpan. Berkas baru seperti state.js dan events.js ikut tersimpan karena berada di dalam folder semester.</w:t>
             </w:r>
           </w:p>
@@ -18058,7 +18393,6 @@
   <w:style w:type="character" w:default="1" w:styleId="DefaultParagraphFont">
     <w:name w:val="Default Paragraph Font"/>
     <w:uiPriority w:val="1"/>
-    <w:semiHidden/>
     <w:unhideWhenUsed/>
   </w:style>
   <w:style w:type="table" w:default="1" w:styleId="TableNormal">

</xml_diff>